<commit_message>
Any objections? as politics; Porter and Reading obituaries as obituary
Co-Authored-By: Claude Sonnet 5.5 <noreply@anthropic.com>
</commit_message>
<xml_diff>
--- a/content-src/docx/R O 1998 10 11 Protest.docx
+++ b/content-src/docx/R O 1998 10 11 Protest.docx
@@ -27,6 +27,11 @@
       </w:r>
       <w:r>
         <w:t xml:space="preserve">Penguin £20, pp440&lt;/details&gt;</w:t>
+      </w:r>
+    </w:p>
+    <w:p>
+      <w:r>
+        <w:t xml:space="preserve">&lt;category&gt;politics&lt;/category&gt;</w:t>
       </w:r>
     </w:p>
     <w:p>

</xml_diff>